<commit_message>
Update concept and Gantt
</commit_message>
<xml_diff>
--- a/Theory/Concept_Franzelin.docx
+++ b/Theory/Concept_Franzelin.docx
@@ -35,21 +35,7 @@
         <w:rPr>
           <w:rFonts w:ascii="Calibri" w:hAnsi="Calibri" w:cs="Calibri"/>
         </w:rPr>
-        <w:t>Extracting building footprints has long been an essential task in aerial imagery interpretation and GIScience, supporting applications such as disaster management, urban planning, and infrastructure monitoring (</w:t>
-      </w:r>
-      <w:proofErr w:type="spellStart"/>
-      <w:r>
-        <w:rPr>
-          <w:rFonts w:ascii="Calibri" w:hAnsi="Calibri" w:cs="Calibri"/>
-        </w:rPr>
-        <w:t>Awrangjeb</w:t>
-      </w:r>
-      <w:proofErr w:type="spellEnd"/>
-      <w:r>
-        <w:rPr>
-          <w:rFonts w:ascii="Calibri" w:hAnsi="Calibri" w:cs="Calibri"/>
-        </w:rPr>
-        <w:t xml:space="preserve"> et al., 2010). Accurate and up-to-date building footprints are not only required by national mapping agencies for maintaining topographic </w:t>
+        <w:t xml:space="preserve">Extracting building footprints has long been an essential task in aerial imagery interpretation and GIScience, supporting applications such as disaster management, urban planning, and infrastructure monitoring (Awrangjeb et al., 2010). Accurate and up-to-date building footprints are not only required by national mapping agencies for maintaining topographic </w:t>
       </w:r>
       <w:r>
         <w:rPr>
@@ -73,21 +59,7 @@
         <w:rPr>
           <w:rFonts w:ascii="Calibri" w:hAnsi="Calibri" w:cs="Calibri"/>
         </w:rPr>
-        <w:t xml:space="preserve"> example, after hurricanes in Jamaica, earthquakes in Afghanistan, or the war in Ukraine (</w:t>
-      </w:r>
-      <w:proofErr w:type="spellStart"/>
-      <w:r>
-        <w:rPr>
-          <w:rFonts w:ascii="Calibri" w:hAnsi="Calibri" w:cs="Calibri"/>
-        </w:rPr>
-        <w:t>Aimati</w:t>
-      </w:r>
-      <w:proofErr w:type="spellEnd"/>
-      <w:r>
-        <w:rPr>
-          <w:rFonts w:ascii="Calibri" w:hAnsi="Calibri" w:cs="Calibri"/>
-        </w:rPr>
-        <w:t xml:space="preserve">, 2023). While global AI-generated datasets such </w:t>
+        <w:t xml:space="preserve"> example, after hurricanes in Jamaica, earthquakes in Afghanistan, or the war in Ukraine (Aimati, 2023). While global AI-generated datasets such </w:t>
       </w:r>
       <w:r>
         <w:rPr>
@@ -257,7 +229,7 @@
     </w:p>
     <w:p>
       <w:pPr>
-        <w:pStyle w:val="Caption"/>
+        <w:pStyle w:val="Beschriftung"/>
         <w:rPr>
           <w:rFonts w:ascii="Calibri" w:hAnsi="Calibri" w:cs="Calibri"/>
           <w:lang w:val="en-US"/>
@@ -772,7 +744,7 @@
     </w:p>
     <w:p>
       <w:pPr>
-        <w:pStyle w:val="ListParagraph"/>
+        <w:pStyle w:val="Listenabsatz"/>
         <w:numPr>
           <w:ilvl w:val="0"/>
           <w:numId w:val="11"/>
@@ -799,7 +771,7 @@
     </w:p>
     <w:p>
       <w:pPr>
-        <w:pStyle w:val="ListParagraph"/>
+        <w:pStyle w:val="Listenabsatz"/>
         <w:numPr>
           <w:ilvl w:val="0"/>
           <w:numId w:val="11"/>
@@ -846,7 +818,7 @@
     </w:p>
     <w:p>
       <w:pPr>
-        <w:pStyle w:val="ListParagraph"/>
+        <w:pStyle w:val="Listenabsatz"/>
         <w:numPr>
           <w:ilvl w:val="0"/>
           <w:numId w:val="11"/>
@@ -1199,7 +1171,7 @@
     </w:p>
     <w:p>
       <w:pPr>
-        <w:pStyle w:val="Caption"/>
+        <w:pStyle w:val="Beschriftung"/>
         <w:rPr>
           <w:rFonts w:ascii="Calibri" w:hAnsi="Calibri" w:cs="Calibri"/>
           <w:lang w:val="en-US"/>
@@ -1394,49 +1366,7 @@
         <w:rPr>
           <w:rFonts w:ascii="Calibri" w:hAnsi="Calibri" w:cs="Calibri"/>
         </w:rPr>
-        <w:t xml:space="preserve">As a reference and benchmark, the workflow will first be developed using artificially degraded building footprints, together with </w:t>
-      </w:r>
-      <w:proofErr w:type="spellStart"/>
-      <w:r>
-        <w:rPr>
-          <w:rFonts w:ascii="Calibri" w:hAnsi="Calibri" w:cs="Calibri"/>
-        </w:rPr>
-        <w:t>SwissImage</w:t>
-      </w:r>
-      <w:proofErr w:type="spellEnd"/>
-      <w:r>
-        <w:rPr>
-          <w:rFonts w:ascii="Calibri" w:hAnsi="Calibri" w:cs="Calibri"/>
-        </w:rPr>
-        <w:t xml:space="preserve"> aerial imagery and the high-quality </w:t>
-      </w:r>
-      <w:proofErr w:type="spellStart"/>
-      <w:r>
-        <w:rPr>
-          <w:rFonts w:ascii="Calibri" w:hAnsi="Calibri" w:cs="Calibri"/>
-        </w:rPr>
-        <w:t>swisstopo</w:t>
-      </w:r>
-      <w:proofErr w:type="spellEnd"/>
-      <w:r>
-        <w:rPr>
-          <w:rFonts w:ascii="Calibri" w:hAnsi="Calibri" w:cs="Calibri"/>
-        </w:rPr>
-        <w:t xml:space="preserve"> TLM dataset (</w:t>
-      </w:r>
-      <w:proofErr w:type="spellStart"/>
-      <w:r>
-        <w:rPr>
-          <w:rFonts w:ascii="Calibri" w:hAnsi="Calibri" w:cs="Calibri"/>
-        </w:rPr>
-        <w:t>swisstopo</w:t>
-      </w:r>
-      <w:proofErr w:type="spellEnd"/>
-      <w:r>
-        <w:rPr>
-          <w:rFonts w:ascii="Calibri" w:hAnsi="Calibri" w:cs="Calibri"/>
-        </w:rPr>
-        <w:t xml:space="preserve">, 2025). This controlled setting allows the method’s behaviour to be evaluated systematically and enables the </w:t>
+        <w:t xml:space="preserve">As a reference and benchmark, the workflow will first be developed using artificially degraded building footprints, together with SwissImage aerial imagery and the high-quality swisstopo TLM dataset (swisstopo, 2025). This controlled setting allows the method’s behaviour to be evaluated systematically and enables the </w:t>
       </w:r>
       <w:r>
         <w:rPr>
@@ -1465,21 +1395,18 @@
       <w:r>
         <w:rPr>
           <w:rFonts w:ascii="Calibri" w:hAnsi="Calibri" w:cs="Calibri"/>
-          <w:lang w:val="en-CH"/>
         </w:rPr>
         <w:t>xView2 Team</w:t>
       </w:r>
       <w:r>
         <w:rPr>
           <w:rFonts w:ascii="Calibri" w:hAnsi="Calibri" w:cs="Calibri"/>
-          <w:lang w:val="en-CH"/>
         </w:rPr>
         <w:t xml:space="preserve">, </w:t>
       </w:r>
       <w:r>
         <w:rPr>
           <w:rFonts w:ascii="Calibri" w:hAnsi="Calibri" w:cs="Calibri"/>
-          <w:lang w:val="en-CH"/>
         </w:rPr>
         <w:t>2019</w:t>
       </w:r>
@@ -1505,21 +1432,7 @@
         <w:rPr>
           <w:rFonts w:ascii="Calibri" w:hAnsi="Calibri" w:cs="Calibri"/>
         </w:rPr>
-        <w:t xml:space="preserve">lygons will be inspected manually to ensure the reliability of the evaluation. Because the </w:t>
-      </w:r>
-      <w:proofErr w:type="spellStart"/>
-      <w:r>
-        <w:rPr>
-          <w:rFonts w:ascii="Calibri" w:hAnsi="Calibri" w:cs="Calibri"/>
-        </w:rPr>
-        <w:t>swisstopo</w:t>
-      </w:r>
-      <w:proofErr w:type="spellEnd"/>
-      <w:r>
-        <w:rPr>
-          <w:rFonts w:ascii="Calibri" w:hAnsi="Calibri" w:cs="Calibri"/>
-        </w:rPr>
-        <w:t xml:space="preserve"> dataset is subject to licensing </w:t>
+        <w:t xml:space="preserve">lygons will be inspected manually to ensure the reliability of the evaluation. Because the swisstopo dataset is subject to licensing </w:t>
       </w:r>
       <w:r>
         <w:rPr>
@@ -1543,14 +1456,7 @@
           <w:rFonts w:ascii="Calibri" w:hAnsi="Calibri" w:cs="Calibri"/>
           <w:lang w:val="en-US"/>
         </w:rPr>
-        <w:t>)</w:t>
-      </w:r>
-      <w:r>
-        <w:rPr>
-          <w:rFonts w:ascii="Calibri" w:hAnsi="Calibri" w:cs="Calibri"/>
-          <w:lang w:val="en-US"/>
-        </w:rPr>
-        <w:t xml:space="preserve"> </w:t>
+        <w:t xml:space="preserve">) </w:t>
       </w:r>
       <w:r>
         <w:rPr>
@@ -1596,6 +1502,7 @@
       <w:r>
         <w:rPr>
           <w:rFonts w:ascii="Calibri" w:hAnsi="Calibri" w:cs="Calibri"/>
+          <w:noProof/>
         </w:rPr>
         <w:lastRenderedPageBreak/>
         <w:drawing>
@@ -1656,7 +1563,7 @@
     </w:p>
     <w:p>
       <w:pPr>
-        <w:pStyle w:val="Caption"/>
+        <w:pStyle w:val="Beschriftung"/>
         <w:rPr>
           <w:rFonts w:ascii="Calibri" w:hAnsi="Calibri" w:cs="Calibri"/>
           <w:lang w:val="en-US"/>
@@ -1724,13 +1631,11 @@
         <w:spacing w:after="0"/>
         <w:rPr>
           <w:rFonts w:ascii="Calibri" w:hAnsi="Calibri" w:cs="Calibri"/>
-          <w:lang w:val="en-CH"/>
-        </w:rPr>
-      </w:pPr>
-      <w:r>
-        <w:rPr>
-          <w:rFonts w:ascii="Calibri" w:hAnsi="Calibri" w:cs="Calibri"/>
-          <w:lang w:val="en-CH"/>
+        </w:rPr>
+      </w:pPr>
+      <w:r>
+        <w:rPr>
+          <w:rFonts w:ascii="Calibri" w:hAnsi="Calibri" w:cs="Calibri"/>
         </w:rPr>
         <w:t>M1: Concept &amp; literature overview done</w:t>
       </w:r>
@@ -1740,13 +1645,11 @@
         <w:spacing w:after="0"/>
         <w:rPr>
           <w:rFonts w:ascii="Calibri" w:hAnsi="Calibri" w:cs="Calibri"/>
-          <w:lang w:val="en-CH"/>
-        </w:rPr>
-      </w:pPr>
-      <w:r>
-        <w:rPr>
-          <w:rFonts w:ascii="Calibri" w:hAnsi="Calibri" w:cs="Calibri"/>
-          <w:lang w:val="en-CH"/>
+        </w:rPr>
+      </w:pPr>
+      <w:r>
+        <w:rPr>
+          <w:rFonts w:ascii="Calibri" w:hAnsi="Calibri" w:cs="Calibri"/>
         </w:rPr>
         <w:t>M2: MLLM error detection ready</w:t>
       </w:r>
@@ -1756,13 +1659,11 @@
         <w:spacing w:after="0"/>
         <w:rPr>
           <w:rFonts w:ascii="Calibri" w:hAnsi="Calibri" w:cs="Calibri"/>
-          <w:lang w:val="en-CH"/>
-        </w:rPr>
-      </w:pPr>
-      <w:r>
-        <w:rPr>
-          <w:rFonts w:ascii="Calibri" w:hAnsi="Calibri" w:cs="Calibri"/>
-          <w:lang w:val="en-CH"/>
+        </w:rPr>
+      </w:pPr>
+      <w:r>
+        <w:rPr>
+          <w:rFonts w:ascii="Calibri" w:hAnsi="Calibri" w:cs="Calibri"/>
         </w:rPr>
         <w:t>M3: Visual model refinement ready</w:t>
       </w:r>
@@ -1772,13 +1673,11 @@
         <w:spacing w:after="0"/>
         <w:rPr>
           <w:rFonts w:ascii="Calibri" w:hAnsi="Calibri" w:cs="Calibri"/>
-          <w:lang w:val="en-CH"/>
-        </w:rPr>
-      </w:pPr>
-      <w:r>
-        <w:rPr>
-          <w:rFonts w:ascii="Calibri" w:hAnsi="Calibri" w:cs="Calibri"/>
-          <w:lang w:val="en-CH"/>
+        </w:rPr>
+      </w:pPr>
+      <w:r>
+        <w:rPr>
+          <w:rFonts w:ascii="Calibri" w:hAnsi="Calibri" w:cs="Calibri"/>
         </w:rPr>
         <w:t xml:space="preserve">M4: Integrated pipeline running </w:t>
       </w:r>
@@ -1788,13 +1687,11 @@
         <w:spacing w:after="0"/>
         <w:rPr>
           <w:rFonts w:ascii="Calibri" w:hAnsi="Calibri" w:cs="Calibri"/>
-          <w:lang w:val="en-CH"/>
-        </w:rPr>
-      </w:pPr>
-      <w:r>
-        <w:rPr>
-          <w:rFonts w:ascii="Calibri" w:hAnsi="Calibri" w:cs="Calibri"/>
-          <w:lang w:val="en-CH"/>
+        </w:rPr>
+      </w:pPr>
+      <w:r>
+        <w:rPr>
+          <w:rFonts w:ascii="Calibri" w:hAnsi="Calibri" w:cs="Calibri"/>
         </w:rPr>
         <w:t>M5: Use-case results ready</w:t>
       </w:r>
@@ -1804,13 +1701,11 @@
         <w:spacing w:after="0"/>
         <w:rPr>
           <w:rFonts w:ascii="Calibri" w:hAnsi="Calibri" w:cs="Calibri"/>
-          <w:lang w:val="en-CH"/>
-        </w:rPr>
-      </w:pPr>
-      <w:r>
-        <w:rPr>
-          <w:rFonts w:ascii="Calibri" w:hAnsi="Calibri" w:cs="Calibri"/>
-          <w:lang w:val="en-CH"/>
+        </w:rPr>
+      </w:pPr>
+      <w:r>
+        <w:rPr>
+          <w:rFonts w:ascii="Calibri" w:hAnsi="Calibri" w:cs="Calibri"/>
         </w:rPr>
         <w:t>M6: Writing until Discussion done</w:t>
       </w:r>
@@ -1820,13 +1715,11 @@
         <w:spacing w:after="0"/>
         <w:rPr>
           <w:rFonts w:ascii="Calibri" w:hAnsi="Calibri" w:cs="Calibri"/>
-          <w:lang w:val="en-CH"/>
-        </w:rPr>
-      </w:pPr>
-      <w:r>
-        <w:rPr>
-          <w:rFonts w:ascii="Calibri" w:hAnsi="Calibri" w:cs="Calibri"/>
-          <w:lang w:val="en-CH"/>
+        </w:rPr>
+      </w:pPr>
+      <w:r>
+        <w:rPr>
+          <w:rFonts w:ascii="Calibri" w:hAnsi="Calibri" w:cs="Calibri"/>
         </w:rPr>
         <w:t>M7: Full writing finished</w:t>
       </w:r>
@@ -1836,13 +1729,11 @@
         <w:spacing w:after="0"/>
         <w:rPr>
           <w:rFonts w:ascii="Calibri" w:hAnsi="Calibri" w:cs="Calibri"/>
-          <w:lang w:val="en-CH"/>
-        </w:rPr>
-      </w:pPr>
-      <w:r>
-        <w:rPr>
-          <w:rFonts w:ascii="Calibri" w:hAnsi="Calibri" w:cs="Calibri"/>
-          <w:lang w:val="en-CH"/>
+        </w:rPr>
+      </w:pPr>
+      <w:r>
+        <w:rPr>
+          <w:rFonts w:ascii="Calibri" w:hAnsi="Calibri" w:cs="Calibri"/>
         </w:rPr>
         <w:t>M8: Submission</w:t>
       </w:r>
@@ -1852,7 +1743,6 @@
         <w:spacing w:after="0"/>
         <w:rPr>
           <w:rFonts w:ascii="Calibri" w:hAnsi="Calibri" w:cs="Calibri"/>
-          <w:lang w:val="en-CH"/>
         </w:rPr>
       </w:pPr>
     </w:p>
@@ -1905,21 +1795,7 @@
         <w:rPr>
           <w:rFonts w:ascii="Calibri" w:hAnsi="Calibri" w:cs="Calibri"/>
         </w:rPr>
-        <w:t xml:space="preserve">I confirm that I have checked the accuracy of the AI-generated content to the best of my knowledge and </w:t>
-      </w:r>
-      <w:proofErr w:type="gramStart"/>
-      <w:r>
-        <w:rPr>
-          <w:rFonts w:ascii="Calibri" w:hAnsi="Calibri" w:cs="Calibri"/>
-        </w:rPr>
-        <w:t>beliefs</w:t>
-      </w:r>
-      <w:proofErr w:type="gramEnd"/>
-      <w:r>
-        <w:rPr>
-          <w:rFonts w:ascii="Calibri" w:hAnsi="Calibri" w:cs="Calibri"/>
-        </w:rPr>
-        <w:t xml:space="preserve"> and I declare that I personally take the full responsibility for this human-machine collaboration outcome.</w:t>
+        <w:t>I confirm that I have checked the accuracy of the AI-generated content to the best of my knowledge and beliefs and I declare that I personally take the full responsibility for this human-machine collaboration outcome.</w:t>
       </w:r>
     </w:p>
     <w:p>
@@ -2101,23 +1977,7 @@
           <w:rFonts w:ascii="Calibri" w:hAnsi="Calibri" w:cs="Calibri"/>
           <w:lang w:val="en-US"/>
         </w:rPr>
-        <w:t xml:space="preserve">, M. (2024). Pix2Poly: A sequence prediction method for end-to-end polygonal building footprint extraction from remote sensing imagery. Proceedings of the IEEE/CVF Winter Conference on Applications </w:t>
-      </w:r>
-      <w:proofErr w:type="gramStart"/>
-      <w:r>
-        <w:rPr>
-          <w:rFonts w:ascii="Calibri" w:hAnsi="Calibri" w:cs="Calibri"/>
-          <w:lang w:val="en-US"/>
-        </w:rPr>
-        <w:t>of</w:t>
-      </w:r>
-      <w:proofErr w:type="gramEnd"/>
-      <w:r>
-        <w:rPr>
-          <w:rFonts w:ascii="Calibri" w:hAnsi="Calibri" w:cs="Calibri"/>
-          <w:lang w:val="en-US"/>
-        </w:rPr>
-        <w:t xml:space="preserve"> Computer Vision (WACV 2025). IEEE. https://arxiv.org/abs/2412.07899 </w:t>
+        <w:t xml:space="preserve">, M. (2024). Pix2Poly: A sequence prediction method for end-to-end polygonal building footprint extraction from remote sensing imagery. Proceedings of the IEEE/CVF Winter Conference on Applications of Computer Vision (WACV 2025). IEEE. https://arxiv.org/abs/2412.07899 </w:t>
       </w:r>
     </w:p>
     <w:p>
@@ -2150,73 +2010,110 @@
           <w:lang w:val="en-US"/>
         </w:rPr>
         <w:br/>
-        <w:t>https://arxiv.org/abs/2108.07258</w:t>
-      </w:r>
-    </w:p>
-    <w:p>
-      <w:pPr>
-        <w:rPr>
-          <w:rFonts w:ascii="Calibri" w:hAnsi="Calibri" w:cs="Calibri"/>
-          <w:lang w:val="en-US"/>
-        </w:rPr>
-      </w:pPr>
-      <w:r>
-        <w:rPr>
-          <w:rFonts w:ascii="Calibri" w:hAnsi="Calibri" w:cs="Calibri"/>
-          <w:lang w:val="de-DE"/>
-        </w:rPr>
-        <w:t xml:space="preserve">Ji, Y., Gao, S., Nie, Y., Majić, I., &amp; Janowicz, K. (2025). </w:t>
-      </w:r>
-      <w:r>
-        <w:rPr>
-          <w:rFonts w:ascii="Calibri" w:hAnsi="Calibri" w:cs="Calibri"/>
-          <w:lang w:val="en-US"/>
-        </w:rPr>
-        <w:t>Foundation models for geospatial reasoning: Assessing the capabilities of large language models in understanding geometries and topological spatial relations. International Journal of Geographical Information Science. (Preprint version compiled June 12, 2025).</w:t>
-      </w:r>
-    </w:p>
-    <w:p>
-      <w:pPr>
-        <w:rPr>
-          <w:rFonts w:ascii="Calibri" w:hAnsi="Calibri" w:cs="Calibri"/>
-          <w:lang w:val="en-US"/>
-        </w:rPr>
-      </w:pPr>
-      <w:r>
-        <w:rPr>
-          <w:rFonts w:ascii="Calibri" w:hAnsi="Calibri" w:cs="Calibri"/>
-          <w:lang w:val="it-IT"/>
-        </w:rPr>
-        <w:t xml:space="preserve">Kirillov, A., Mintun, E., Ravi, N., Mao, H., Rolland, C., Gustafson, L., ... </w:t>
-      </w:r>
-      <w:r>
-        <w:rPr>
-          <w:rFonts w:ascii="Calibri" w:hAnsi="Calibri" w:cs="Calibri"/>
-          <w:lang w:val="en-US"/>
-        </w:rPr>
-        <w:t xml:space="preserve">&amp; </w:t>
-      </w:r>
-      <w:proofErr w:type="spellStart"/>
-      <w:r>
-        <w:rPr>
-          <w:rFonts w:ascii="Calibri" w:hAnsi="Calibri" w:cs="Calibri"/>
-          <w:lang w:val="en-US"/>
-        </w:rPr>
-        <w:t>Girshick</w:t>
-      </w:r>
-      <w:proofErr w:type="spellEnd"/>
-      <w:r>
-        <w:rPr>
-          <w:rFonts w:ascii="Calibri" w:hAnsi="Calibri" w:cs="Calibri"/>
-          <w:lang w:val="en-US"/>
-        </w:rPr>
-        <w:t>, R. (2023). Segment anything. In </w:t>
+      </w:r>
+      <w:hyperlink r:id="rId13" w:history="1">
+        <w:r>
+          <w:rPr>
+            <w:rStyle w:val="Hyperlink"/>
+            <w:rFonts w:ascii="Calibri" w:hAnsi="Calibri" w:cs="Calibri"/>
+            <w:lang w:val="en-US"/>
+          </w:rPr>
+          <w:t>https://arxiv.org/abs/2108.07258</w:t>
+        </w:r>
+      </w:hyperlink>
+    </w:p>
+    <w:p>
+      <w:pPr>
+        <w:rPr>
+          <w:rFonts w:ascii="Calibri" w:hAnsi="Calibri" w:cs="Calibri"/>
+          <w:lang w:val="en-US"/>
+        </w:rPr>
+      </w:pPr>
+      <w:r>
+        <w:rPr>
+          <w:rFonts w:ascii="Calibri" w:hAnsi="Calibri" w:cs="Calibri"/>
+        </w:rPr>
+        <w:t>Dosovitskiy, A. (2020). An image is worth 16x16 words: Transformers for image recognition at scale. </w:t>
       </w:r>
       <w:r>
         <w:rPr>
           <w:rFonts w:ascii="Calibri" w:hAnsi="Calibri" w:cs="Calibri"/>
           <w:i/>
           <w:iCs/>
+        </w:rPr>
+        <w:t>arXiv preprint arXiv:2010.11929</w:t>
+      </w:r>
+      <w:r>
+        <w:rPr>
+          <w:rFonts w:ascii="Calibri" w:hAnsi="Calibri" w:cs="Calibri"/>
+        </w:rPr>
+        <w:t>.</w:t>
+      </w:r>
+    </w:p>
+    <w:p>
+      <w:pPr>
+        <w:rPr>
+          <w:rFonts w:ascii="Calibri" w:hAnsi="Calibri" w:cs="Calibri"/>
+          <w:lang w:val="en-US"/>
+        </w:rPr>
+      </w:pPr>
+      <w:r>
+        <w:rPr>
+          <w:rFonts w:ascii="Calibri" w:hAnsi="Calibri" w:cs="Calibri"/>
+          <w:lang w:val="de-DE"/>
+        </w:rPr>
+        <w:t xml:space="preserve">Ji, Y., Gao, S., Nie, Y., Majić, I., &amp; Janowicz, K. (2025). </w:t>
+      </w:r>
+      <w:r>
+        <w:rPr>
+          <w:rFonts w:ascii="Calibri" w:hAnsi="Calibri" w:cs="Calibri"/>
+          <w:lang w:val="en-US"/>
+        </w:rPr>
+        <w:t>Foundation models for geospatial reasoning: Assessing the capabilities of large language models in understanding geometries and topological spatial relations. International Journal of Geographical Information Science. (Preprint version compiled June 12, 2025).</w:t>
+      </w:r>
+    </w:p>
+    <w:p>
+      <w:pPr>
+        <w:rPr>
+          <w:rFonts w:ascii="Calibri" w:hAnsi="Calibri" w:cs="Calibri"/>
+          <w:lang w:val="en-US"/>
+        </w:rPr>
+      </w:pPr>
+      <w:r>
+        <w:rPr>
+          <w:rFonts w:ascii="Calibri" w:hAnsi="Calibri" w:cs="Calibri"/>
+          <w:lang w:val="it-IT"/>
+        </w:rPr>
+        <w:t xml:space="preserve">Kirillov, A., Mintun, E., Ravi, N., Mao, H., Rolland, C., Gustafson, L., ... </w:t>
+      </w:r>
+      <w:r>
+        <w:rPr>
+          <w:rFonts w:ascii="Calibri" w:hAnsi="Calibri" w:cs="Calibri"/>
+          <w:lang w:val="en-US"/>
+        </w:rPr>
+        <w:t xml:space="preserve">&amp; </w:t>
+      </w:r>
+      <w:proofErr w:type="spellStart"/>
+      <w:r>
+        <w:rPr>
+          <w:rFonts w:ascii="Calibri" w:hAnsi="Calibri" w:cs="Calibri"/>
+          <w:lang w:val="en-US"/>
+        </w:rPr>
+        <w:t>Girshick</w:t>
+      </w:r>
+      <w:proofErr w:type="spellEnd"/>
+      <w:r>
+        <w:rPr>
+          <w:rFonts w:ascii="Calibri" w:hAnsi="Calibri" w:cs="Calibri"/>
+          <w:lang w:val="en-US"/>
+        </w:rPr>
+        <w:t>, R. (2023). Segment anything. In </w:t>
+      </w:r>
+      <w:r>
+        <w:rPr>
+          <w:rFonts w:ascii="Calibri" w:hAnsi="Calibri" w:cs="Calibri"/>
+          <w:i/>
+          <w:iCs/>
           <w:lang w:val="en-US"/>
         </w:rPr>
         <w:t>Proceedings of the IEEE/CVF international conference on computer vision</w:t>
@@ -2290,7 +2187,7 @@
         </w:rPr>
         <w:t xml:space="preserve"> </w:t>
       </w:r>
-      <w:hyperlink r:id="rId13" w:history="1">
+      <w:hyperlink r:id="rId14" w:history="1">
         <w:r>
           <w:rPr>
             <w:rFonts w:ascii="Calibri" w:hAnsi="Calibri" w:cs="Calibri"/>
@@ -2314,7 +2211,7 @@
         </w:rPr>
         <w:t xml:space="preserve">Rastogi, A., Singh, A. K., &amp; Sharma, A. (2022). Automatic building footprint extraction from very high-resolution imagery using deep learning techniques. ISPRS Journal of Photogrammetry and Remote Sensing, 183, 176–188. </w:t>
       </w:r>
-      <w:hyperlink r:id="rId14" w:history="1">
+      <w:hyperlink r:id="rId15" w:history="1">
         <w:r>
           <w:rPr>
             <w:rFonts w:ascii="Calibri" w:hAnsi="Calibri" w:cs="Calibri"/>
@@ -2465,7 +2362,7 @@
         </w:rPr>
         <w:t xml:space="preserve">. </w:t>
       </w:r>
-      <w:hyperlink r:id="rId15" w:tgtFrame="_new" w:history="1">
+      <w:hyperlink r:id="rId16" w:tgtFrame="_new" w:history="1">
         <w:r>
           <w:rPr>
             <w:rStyle w:val="Hyperlink"/>
@@ -2487,80 +2384,43 @@
         <w:rPr>
           <w:rFonts w:ascii="Calibri" w:hAnsi="Calibri" w:cs="Calibri"/>
         </w:rPr>
-        <w:t xml:space="preserve">Sirko, W., </w:t>
-      </w:r>
-      <w:proofErr w:type="spellStart"/>
-      <w:r>
-        <w:rPr>
-          <w:rFonts w:ascii="Calibri" w:hAnsi="Calibri" w:cs="Calibri"/>
-        </w:rPr>
-        <w:t>Kashubin</w:t>
-      </w:r>
-      <w:proofErr w:type="spellEnd"/>
-      <w:r>
-        <w:rPr>
-          <w:rFonts w:ascii="Calibri" w:hAnsi="Calibri" w:cs="Calibri"/>
-        </w:rPr>
-        <w:t xml:space="preserve">, S., Ritter, M., </w:t>
-      </w:r>
-      <w:proofErr w:type="spellStart"/>
-      <w:r>
-        <w:rPr>
-          <w:rFonts w:ascii="Calibri" w:hAnsi="Calibri" w:cs="Calibri"/>
-        </w:rPr>
-        <w:t>Annkah</w:t>
-      </w:r>
-      <w:proofErr w:type="spellEnd"/>
-      <w:r>
-        <w:rPr>
-          <w:rFonts w:ascii="Calibri" w:hAnsi="Calibri" w:cs="Calibri"/>
-        </w:rPr>
-        <w:t>, A., Bouchareb, Y. S. E., Dauphin, Y., ... &amp; Quinn, J. (2021). Continental-scale building detection from high resolution satellite imagery. </w:t>
-      </w:r>
-      <w:proofErr w:type="spellStart"/>
+        <w:t>Sirko, W., Kashubin, S., Ritter, M., Annkah, A., Bouchareb, Y. S. E., Dauphin, Y., ... &amp; Quinn, J. (2021). Continental-scale building detection from high resolution satellite imagery. </w:t>
+      </w:r>
       <w:r>
         <w:rPr>
           <w:rFonts w:ascii="Calibri" w:hAnsi="Calibri" w:cs="Calibri"/>
           <w:i/>
           <w:iCs/>
         </w:rPr>
-        <w:t>arXiv</w:t>
-      </w:r>
-      <w:proofErr w:type="spellEnd"/>
+        <w:t>arXiv preprint arXiv:2107.12283</w:t>
+      </w:r>
+      <w:r>
+        <w:rPr>
+          <w:rFonts w:ascii="Calibri" w:hAnsi="Calibri" w:cs="Calibri"/>
+        </w:rPr>
+        <w:t>.</w:t>
+      </w:r>
+    </w:p>
+    <w:p>
+      <w:pPr>
+        <w:rPr>
+          <w:rFonts w:ascii="Calibri" w:hAnsi="Calibri" w:cs="Calibri"/>
+          <w:lang w:val="en-US"/>
+        </w:rPr>
+      </w:pPr>
+      <w:r>
+        <w:rPr>
+          <w:rFonts w:ascii="Calibri" w:hAnsi="Calibri" w:cs="Calibri"/>
+        </w:rPr>
+        <w:lastRenderedPageBreak/>
+        <w:t xml:space="preserve">Google Research. (2023). </w:t>
+      </w:r>
       <w:r>
         <w:rPr>
           <w:rFonts w:ascii="Calibri" w:hAnsi="Calibri" w:cs="Calibri"/>
           <w:i/>
           <w:iCs/>
         </w:rPr>
-        <w:t xml:space="preserve"> preprint arXiv:2107.12283</w:t>
-      </w:r>
-      <w:r>
-        <w:rPr>
-          <w:rFonts w:ascii="Calibri" w:hAnsi="Calibri" w:cs="Calibri"/>
-        </w:rPr>
-        <w:t>.</w:t>
-      </w:r>
-    </w:p>
-    <w:p>
-      <w:pPr>
-        <w:rPr>
-          <w:rFonts w:ascii="Calibri" w:hAnsi="Calibri" w:cs="Calibri"/>
-          <w:lang w:val="en-US"/>
-        </w:rPr>
-      </w:pPr>
-      <w:r>
-        <w:rPr>
-          <w:rFonts w:ascii="Calibri" w:hAnsi="Calibri" w:cs="Calibri"/>
-        </w:rPr>
-        <w:t xml:space="preserve">Google Research. (2023). </w:t>
-      </w:r>
-      <w:r>
-        <w:rPr>
-          <w:rFonts w:ascii="Calibri" w:hAnsi="Calibri" w:cs="Calibri"/>
-          <w:i/>
-          <w:iCs/>
-        </w:rPr>
         <w:t>Google Open Buildings V3 Polygons</w:t>
       </w:r>
       <w:r>
@@ -2569,27 +2429,13 @@
         </w:rPr>
         <w:t xml:space="preserve">. Available from Google Earth Engine: GOOGLE/Research/open-buildings/v3/polygons </w:t>
       </w:r>
-      <w:hyperlink r:id="rId16" w:tgtFrame="_blank" w:history="1">
+      <w:hyperlink r:id="rId17" w:tgtFrame="_blank" w:history="1">
         <w:r>
           <w:rPr>
             <w:rStyle w:val="Hyperlink"/>
             <w:rFonts w:ascii="Calibri" w:hAnsi="Calibri" w:cs="Calibri"/>
           </w:rPr>
-          <w:t>Goo</w:t>
-        </w:r>
-        <w:r>
-          <w:rPr>
-            <w:rStyle w:val="Hyperlink"/>
-            <w:rFonts w:ascii="Calibri" w:hAnsi="Calibri" w:cs="Calibri"/>
-          </w:rPr>
-          <w:t>g</w:t>
-        </w:r>
-        <w:r>
-          <w:rPr>
-            <w:rStyle w:val="Hyperlink"/>
-            <w:rFonts w:ascii="Calibri" w:hAnsi="Calibri" w:cs="Calibri"/>
-          </w:rPr>
-          <w:t>le for Developers+1</w:t>
+          <w:t>Google for Developers+1</w:t>
         </w:r>
       </w:hyperlink>
     </w:p>
@@ -2597,113 +2443,54 @@
       <w:pPr>
         <w:rPr>
           <w:rFonts w:ascii="Calibri" w:hAnsi="Calibri" w:cs="Calibri"/>
-          <w:lang w:val="en-CH"/>
-        </w:rPr>
-      </w:pPr>
-      <w:r>
-        <w:rPr>
-          <w:rFonts w:ascii="Calibri" w:hAnsi="Calibri" w:cs="Calibri"/>
-          <w:lang w:val="en-CH"/>
-        </w:rPr>
-        <w:lastRenderedPageBreak/>
-        <w:t xml:space="preserve">Gupta, R., Hosfelt, R., Sajeev, S., Patel, N., Goodman, S., </w:t>
-      </w:r>
-      <w:proofErr w:type="spellStart"/>
-      <w:r>
-        <w:rPr>
-          <w:rFonts w:ascii="Calibri" w:hAnsi="Calibri" w:cs="Calibri"/>
-          <w:lang w:val="en-CH"/>
-        </w:rPr>
-        <w:t>Raskar</w:t>
-      </w:r>
-      <w:proofErr w:type="spellEnd"/>
-      <w:r>
-        <w:rPr>
-          <w:rFonts w:ascii="Calibri" w:hAnsi="Calibri" w:cs="Calibri"/>
-          <w:lang w:val="en-CH"/>
-        </w:rPr>
-        <w:t xml:space="preserve">, R., &amp; Heim, E. (2019). </w:t>
-      </w:r>
-      <w:proofErr w:type="spellStart"/>
+        </w:rPr>
+      </w:pPr>
+      <w:r>
+        <w:rPr>
+          <w:rFonts w:ascii="Calibri" w:hAnsi="Calibri" w:cs="Calibri"/>
+        </w:rPr>
+        <w:t xml:space="preserve">Gupta, R., Hosfelt, R., Sajeev, S., Patel, N., Goodman, S., Raskar, R., &amp; Heim, E. (2019). </w:t>
+      </w:r>
       <w:r>
         <w:rPr>
           <w:rFonts w:ascii="Calibri" w:hAnsi="Calibri" w:cs="Calibri"/>
           <w:i/>
           <w:iCs/>
-          <w:lang w:val="en-CH"/>
-        </w:rPr>
-        <w:t>xBD</w:t>
-      </w:r>
-      <w:proofErr w:type="spellEnd"/>
+        </w:rPr>
+        <w:t>xBD: A Dataset for Assessing Building Damage from Satellite Imagery</w:t>
+      </w:r>
+      <w:r>
+        <w:rPr>
+          <w:rFonts w:ascii="Calibri" w:hAnsi="Calibri" w:cs="Calibri"/>
+        </w:rPr>
+        <w:t>. Proceedings of the IEEE Conference on Computer Vision and Pattern Recognition (CVPR) Workshops.</w:t>
+      </w:r>
+      <w:r>
+        <w:rPr>
+          <w:rFonts w:ascii="Calibri" w:hAnsi="Calibri" w:cs="Calibri"/>
+        </w:rPr>
+        <w:br/>
+        <w:t xml:space="preserve">xView2 Team. (2019). </w:t>
+      </w:r>
       <w:r>
         <w:rPr>
           <w:rFonts w:ascii="Calibri" w:hAnsi="Calibri" w:cs="Calibri"/>
           <w:i/>
           <w:iCs/>
-          <w:lang w:val="en-CH"/>
-        </w:rPr>
-        <w:t>: A Dataset for Assessing Building Damage from Satellite Imagery</w:t>
-      </w:r>
-      <w:r>
-        <w:rPr>
-          <w:rFonts w:ascii="Calibri" w:hAnsi="Calibri" w:cs="Calibri"/>
-          <w:lang w:val="en-CH"/>
-        </w:rPr>
-        <w:t>. Proceedings of the IEEE Conference on Computer Vision and Pattern Recognition (CVPR) Workshops.</w:t>
-      </w:r>
-      <w:r>
-        <w:rPr>
-          <w:rFonts w:ascii="Calibri" w:hAnsi="Calibri" w:cs="Calibri"/>
-          <w:lang w:val="en-CH"/>
-        </w:rPr>
-        <w:br/>
-        <w:t xml:space="preserve">xView2 Team. (2019). </w:t>
-      </w:r>
-      <w:r>
-        <w:rPr>
-          <w:rFonts w:ascii="Calibri" w:hAnsi="Calibri" w:cs="Calibri"/>
-          <w:i/>
-          <w:iCs/>
-          <w:lang w:val="en-CH"/>
         </w:rPr>
         <w:t>xView2: Building Damage Assessment Challenge Dataset</w:t>
       </w:r>
       <w:r>
         <w:rPr>
           <w:rFonts w:ascii="Calibri" w:hAnsi="Calibri" w:cs="Calibri"/>
-          <w:lang w:val="en-CH"/>
-        </w:rPr>
-        <w:t xml:space="preserve">. Carnegie Mellon University, </w:t>
-      </w:r>
-      <w:proofErr w:type="spellStart"/>
-      <w:r>
-        <w:rPr>
-          <w:rFonts w:ascii="Calibri" w:hAnsi="Calibri" w:cs="Calibri"/>
-          <w:lang w:val="en-CH"/>
-        </w:rPr>
-        <w:t>Defense</w:t>
-      </w:r>
-      <w:proofErr w:type="spellEnd"/>
-      <w:r>
-        <w:rPr>
-          <w:rFonts w:ascii="Calibri" w:hAnsi="Calibri" w:cs="Calibri"/>
-          <w:lang w:val="en-CH"/>
-        </w:rPr>
-        <w:t xml:space="preserve"> Innovation Unit (DIU).</w:t>
-      </w:r>
-      <w:r>
-        <w:rPr>
-          <w:rFonts w:ascii="Calibri" w:hAnsi="Calibri" w:cs="Calibri"/>
-          <w:lang w:val="en-CH"/>
-        </w:rPr>
-        <w:t xml:space="preserve"> </w:t>
-      </w:r>
-      <w:r>
-        <w:rPr>
-          <w:rFonts w:ascii="Calibri" w:hAnsi="Calibri" w:cs="Calibri"/>
-          <w:lang w:val="en-CH"/>
-        </w:rPr>
-        <w:t>https://xview2.org/</w:t>
+        </w:rPr>
+        <w:t>. Carnegie Mellon University, Defense Innovation Unit (DIU).</w:t>
+      </w:r>
+      <w:r>
+        <w:rPr>
+          <w:rFonts w:ascii="Calibri" w:hAnsi="Calibri" w:cs="Calibri"/>
+        </w:rPr>
+        <w:t xml:space="preserve"> https://xview2.org/</w:t>
       </w:r>
     </w:p>
     <w:p>
@@ -2715,7 +2502,7 @@
       </w:pPr>
     </w:p>
     <w:sectPr>
-      <w:headerReference w:type="default" r:id="rId17"/>
+      <w:headerReference w:type="default" r:id="rId18"/>
       <w:pgSz w:w="11906" w:h="16838"/>
       <w:pgMar w:top="1440" w:right="1440" w:bottom="1440" w:left="1440" w:header="708" w:footer="708" w:gutter="0"/>
       <w:cols w:space="708"/>
@@ -2779,7 +2566,7 @@
 <w:hdr xmlns:wpc="http://schemas.microsoft.com/office/word/2010/wordprocessingCanvas" xmlns:cx="http://schemas.microsoft.com/office/drawing/2014/chartex" xmlns:cx1="http://schemas.microsoft.com/office/drawing/2015/9/8/chartex" xmlns:cx2="http://schemas.microsoft.com/office/drawing/2015/10/21/chartex" xmlns:cx3="http://schemas.microsoft.com/office/drawing/2016/5/9/chartex" xmlns:cx4="http://schemas.microsoft.com/office/drawing/2016/5/10/chartex" xmlns:cx5="http://schemas.microsoft.com/office/drawing/2016/5/11/chartex" xmlns:cx6="http://schemas.microsoft.com/office/drawing/2016/5/12/chartex" xmlns:cx7="http://schemas.microsoft.com/office/drawing/2016/5/13/chartex" xmlns:cx8="http://schemas.microsoft.com/office/drawing/2016/5/14/chartex" xmlns:mc="http://schemas.openxmlformats.org/markup-compatibility/2006" xmlns:aink="http://schemas.microsoft.com/office/drawing/2016/ink" xmlns:am3d="http://schemas.microsoft.com/office/drawing/2017/model3d" xmlns:o="urn:schemas-microsoft-com:office:office" xmlns:oel="http://schemas.microsoft.com/office/2019/extlst" xmlns:r="http://schemas.openxmlformats.org/officeDocument/2006/relationships" xmlns:m="http://schemas.openxmlformats.org/officeDocument/2006/math" xmlns:v="urn:schemas-microsoft-com:vml" xmlns:wp14="http://schemas.microsoft.com/office/word/2010/wordprocessingDrawing" xmlns:wp="http://schemas.openxmlformats.org/drawingml/2006/wordprocessingDrawing" xmlns:w10="urn:schemas-microsoft-com:office:word" xmlns:w="http://schemas.openxmlformats.org/wordprocessingml/2006/main" xmlns:w14="http://schemas.microsoft.com/office/word/2010/wordml" xmlns:w15="http://schemas.microsoft.com/office/word/2012/wordml" xmlns:w16cex="http://schemas.microsoft.com/office/word/2018/wordml/cex" xmlns:w16cid="http://schemas.microsoft.com/office/word/2016/wordml/cid" xmlns:w16="http://schemas.microsoft.com/office/word/2018/wordml" xmlns:w16du="http://schemas.microsoft.com/office/word/2023/wordml/word16du" xmlns:w16sdtdh="http://schemas.microsoft.com/office/word/2020/wordml/sdtdatahash" xmlns:w16sdtfl="http://schemas.microsoft.com/office/word/2024/wordml/sdtformatlock" xmlns:w16se="http://schemas.microsoft.com/office/word/2015/wordml/symex" xmlns:wpg="http://schemas.microsoft.com/office/word/2010/wordprocessingGroup" xmlns:wpi="http://schemas.microsoft.com/office/word/2010/wordprocessingInk" xmlns:wne="http://schemas.microsoft.com/office/word/2006/wordml" xmlns:wps="http://schemas.microsoft.com/office/word/2010/wordprocessingShape" mc:Ignorable="w14 w15 w16se w16cid w16 w16cex w16sdtdh w16sdtfl w16du wp14">
   <w:p>
     <w:pPr>
-      <w:pStyle w:val="Header"/>
+      <w:pStyle w:val="Kopfzeile"/>
       <w:rPr>
         <w:lang w:val="en-GB"/>
       </w:rPr>
@@ -4138,7 +3925,7 @@
         <w:kern w:val="2"/>
         <w:sz w:val="24"/>
         <w:szCs w:val="24"/>
-        <w:lang w:val="en-CH" w:eastAsia="en-US" w:bidi="ar-SA"/>
+        <w:lang w:eastAsia="en-US" w:bidi="ar-SA"/>
         <w14:ligatures w14:val="standardContextual"/>
       </w:rPr>
     </w:rPrDefault>
@@ -4526,15 +4313,15 @@
     <w:lsdException w:name="Unresolved Mention" w:semiHidden="1" w:unhideWhenUsed="1"/>
     <w:lsdException w:name="Smart Link" w:semiHidden="1" w:unhideWhenUsed="1"/>
   </w:latentStyles>
-  <w:style w:type="paragraph" w:default="1" w:styleId="Normal">
+  <w:style w:type="paragraph" w:default="1" w:styleId="Standard">
     <w:name w:val="Normal"/>
     <w:qFormat/>
   </w:style>
-  <w:style w:type="paragraph" w:styleId="Heading1">
+  <w:style w:type="paragraph" w:styleId="berschrift1">
     <w:name w:val="heading 1"/>
-    <w:basedOn w:val="Normal"/>
-    <w:next w:val="Normal"/>
-    <w:link w:val="Heading1Char"/>
+    <w:basedOn w:val="Standard"/>
+    <w:next w:val="Standard"/>
+    <w:link w:val="berschrift1Zchn"/>
     <w:uiPriority w:val="9"/>
     <w:qFormat/>
     <w:rsid w:val="00E56932"/>
@@ -4551,11 +4338,11 @@
       <w:szCs w:val="40"/>
     </w:rPr>
   </w:style>
-  <w:style w:type="paragraph" w:styleId="Heading2">
+  <w:style w:type="paragraph" w:styleId="berschrift2">
     <w:name w:val="heading 2"/>
-    <w:basedOn w:val="Normal"/>
-    <w:next w:val="Normal"/>
-    <w:link w:val="Heading2Char"/>
+    <w:basedOn w:val="Standard"/>
+    <w:next w:val="Standard"/>
+    <w:link w:val="berschrift2Zchn"/>
     <w:uiPriority w:val="9"/>
     <w:semiHidden/>
     <w:unhideWhenUsed/>
@@ -4574,11 +4361,11 @@
       <w:szCs w:val="32"/>
     </w:rPr>
   </w:style>
-  <w:style w:type="paragraph" w:styleId="Heading3">
+  <w:style w:type="paragraph" w:styleId="berschrift3">
     <w:name w:val="heading 3"/>
-    <w:basedOn w:val="Normal"/>
-    <w:next w:val="Normal"/>
-    <w:link w:val="Heading3Char"/>
+    <w:basedOn w:val="Standard"/>
+    <w:next w:val="Standard"/>
+    <w:link w:val="berschrift3Zchn"/>
     <w:uiPriority w:val="9"/>
     <w:semiHidden/>
     <w:unhideWhenUsed/>
@@ -4597,11 +4384,11 @@
       <w:szCs w:val="28"/>
     </w:rPr>
   </w:style>
-  <w:style w:type="paragraph" w:styleId="Heading4">
+  <w:style w:type="paragraph" w:styleId="berschrift4">
     <w:name w:val="heading 4"/>
-    <w:basedOn w:val="Normal"/>
-    <w:next w:val="Normal"/>
-    <w:link w:val="Heading4Char"/>
+    <w:basedOn w:val="Standard"/>
+    <w:next w:val="Standard"/>
+    <w:link w:val="berschrift4Zchn"/>
     <w:uiPriority w:val="9"/>
     <w:semiHidden/>
     <w:unhideWhenUsed/>
@@ -4620,11 +4407,11 @@
       <w:color w:val="0F4761" w:themeColor="accent1" w:themeShade="BF"/>
     </w:rPr>
   </w:style>
-  <w:style w:type="paragraph" w:styleId="Heading5">
+  <w:style w:type="paragraph" w:styleId="berschrift5">
     <w:name w:val="heading 5"/>
-    <w:basedOn w:val="Normal"/>
-    <w:next w:val="Normal"/>
-    <w:link w:val="Heading5Char"/>
+    <w:basedOn w:val="Standard"/>
+    <w:next w:val="Standard"/>
+    <w:link w:val="berschrift5Zchn"/>
     <w:uiPriority w:val="9"/>
     <w:semiHidden/>
     <w:unhideWhenUsed/>
@@ -4641,11 +4428,11 @@
       <w:color w:val="0F4761" w:themeColor="accent1" w:themeShade="BF"/>
     </w:rPr>
   </w:style>
-  <w:style w:type="paragraph" w:styleId="Heading6">
+  <w:style w:type="paragraph" w:styleId="berschrift6">
     <w:name w:val="heading 6"/>
-    <w:basedOn w:val="Normal"/>
-    <w:next w:val="Normal"/>
-    <w:link w:val="Heading6Char"/>
+    <w:basedOn w:val="Standard"/>
+    <w:next w:val="Standard"/>
+    <w:link w:val="berschrift6Zchn"/>
     <w:uiPriority w:val="9"/>
     <w:semiHidden/>
     <w:unhideWhenUsed/>
@@ -4664,11 +4451,11 @@
       <w:color w:val="595959" w:themeColor="text1" w:themeTint="A6"/>
     </w:rPr>
   </w:style>
-  <w:style w:type="paragraph" w:styleId="Heading7">
+  <w:style w:type="paragraph" w:styleId="berschrift7">
     <w:name w:val="heading 7"/>
-    <w:basedOn w:val="Normal"/>
-    <w:next w:val="Normal"/>
-    <w:link w:val="Heading7Char"/>
+    <w:basedOn w:val="Standard"/>
+    <w:next w:val="Standard"/>
+    <w:link w:val="berschrift7Zchn"/>
     <w:uiPriority w:val="9"/>
     <w:semiHidden/>
     <w:unhideWhenUsed/>
@@ -4685,11 +4472,11 @@
       <w:color w:val="595959" w:themeColor="text1" w:themeTint="A6"/>
     </w:rPr>
   </w:style>
-  <w:style w:type="paragraph" w:styleId="Heading8">
+  <w:style w:type="paragraph" w:styleId="berschrift8">
     <w:name w:val="heading 8"/>
-    <w:basedOn w:val="Normal"/>
-    <w:next w:val="Normal"/>
-    <w:link w:val="Heading8Char"/>
+    <w:basedOn w:val="Standard"/>
+    <w:next w:val="Standard"/>
+    <w:link w:val="berschrift8Zchn"/>
     <w:uiPriority w:val="9"/>
     <w:semiHidden/>
     <w:unhideWhenUsed/>
@@ -4708,11 +4495,11 @@
       <w:color w:val="272727" w:themeColor="text1" w:themeTint="D8"/>
     </w:rPr>
   </w:style>
-  <w:style w:type="paragraph" w:styleId="Heading9">
+  <w:style w:type="paragraph" w:styleId="berschrift9">
     <w:name w:val="heading 9"/>
-    <w:basedOn w:val="Normal"/>
-    <w:next w:val="Normal"/>
-    <w:link w:val="Heading9Char"/>
+    <w:basedOn w:val="Standard"/>
+    <w:next w:val="Standard"/>
+    <w:link w:val="berschrift9Zchn"/>
     <w:uiPriority w:val="9"/>
     <w:semiHidden/>
     <w:unhideWhenUsed/>
@@ -4729,12 +4516,12 @@
       <w:color w:val="272727" w:themeColor="text1" w:themeTint="D8"/>
     </w:rPr>
   </w:style>
-  <w:style w:type="character" w:default="1" w:styleId="DefaultParagraphFont">
+  <w:style w:type="character" w:default="1" w:styleId="Absatz-Standardschriftart">
     <w:name w:val="Default Paragraph Font"/>
     <w:uiPriority w:val="1"/>
     <w:unhideWhenUsed/>
   </w:style>
-  <w:style w:type="table" w:default="1" w:styleId="TableNormal">
+  <w:style w:type="table" w:default="1" w:styleId="NormaleTabelle">
     <w:name w:val="Normal Table"/>
     <w:uiPriority w:val="99"/>
     <w:semiHidden/>
@@ -4749,16 +4536,16 @@
       </w:tblCellMar>
     </w:tblPr>
   </w:style>
-  <w:style w:type="numbering" w:default="1" w:styleId="NoList">
+  <w:style w:type="numbering" w:default="1" w:styleId="KeineListe">
     <w:name w:val="No List"/>
     <w:uiPriority w:val="99"/>
     <w:semiHidden/>
     <w:unhideWhenUsed/>
   </w:style>
-  <w:style w:type="character" w:customStyle="1" w:styleId="Heading1Char">
-    <w:name w:val="Heading 1 Char"/>
-    <w:basedOn w:val="DefaultParagraphFont"/>
-    <w:link w:val="Heading1"/>
+  <w:style w:type="character" w:customStyle="1" w:styleId="berschrift1Zchn">
+    <w:name w:val="Überschrift 1 Zchn"/>
+    <w:basedOn w:val="Absatz-Standardschriftart"/>
+    <w:link w:val="berschrift1"/>
     <w:uiPriority w:val="9"/>
     <w:rsid w:val="00E56932"/>
     <w:rPr>
@@ -4768,10 +4555,10 @@
       <w:szCs w:val="40"/>
     </w:rPr>
   </w:style>
-  <w:style w:type="character" w:customStyle="1" w:styleId="Heading2Char">
-    <w:name w:val="Heading 2 Char"/>
-    <w:basedOn w:val="DefaultParagraphFont"/>
-    <w:link w:val="Heading2"/>
+  <w:style w:type="character" w:customStyle="1" w:styleId="berschrift2Zchn">
+    <w:name w:val="Überschrift 2 Zchn"/>
+    <w:basedOn w:val="Absatz-Standardschriftart"/>
+    <w:link w:val="berschrift2"/>
     <w:uiPriority w:val="9"/>
     <w:semiHidden/>
     <w:rsid w:val="00E56932"/>
@@ -4782,10 +4569,10 @@
       <w:szCs w:val="32"/>
     </w:rPr>
   </w:style>
-  <w:style w:type="character" w:customStyle="1" w:styleId="Heading3Char">
-    <w:name w:val="Heading 3 Char"/>
-    <w:basedOn w:val="DefaultParagraphFont"/>
-    <w:link w:val="Heading3"/>
+  <w:style w:type="character" w:customStyle="1" w:styleId="berschrift3Zchn">
+    <w:name w:val="Überschrift 3 Zchn"/>
+    <w:basedOn w:val="Absatz-Standardschriftart"/>
+    <w:link w:val="berschrift3"/>
     <w:uiPriority w:val="9"/>
     <w:semiHidden/>
     <w:rsid w:val="00E56932"/>
@@ -4796,10 +4583,10 @@
       <w:szCs w:val="28"/>
     </w:rPr>
   </w:style>
-  <w:style w:type="character" w:customStyle="1" w:styleId="Heading4Char">
-    <w:name w:val="Heading 4 Char"/>
-    <w:basedOn w:val="DefaultParagraphFont"/>
-    <w:link w:val="Heading4"/>
+  <w:style w:type="character" w:customStyle="1" w:styleId="berschrift4Zchn">
+    <w:name w:val="Überschrift 4 Zchn"/>
+    <w:basedOn w:val="Absatz-Standardschriftart"/>
+    <w:link w:val="berschrift4"/>
     <w:uiPriority w:val="9"/>
     <w:semiHidden/>
     <w:rsid w:val="00E56932"/>
@@ -4810,10 +4597,10 @@
       <w:color w:val="0F4761" w:themeColor="accent1" w:themeShade="BF"/>
     </w:rPr>
   </w:style>
-  <w:style w:type="character" w:customStyle="1" w:styleId="Heading5Char">
-    <w:name w:val="Heading 5 Char"/>
-    <w:basedOn w:val="DefaultParagraphFont"/>
-    <w:link w:val="Heading5"/>
+  <w:style w:type="character" w:customStyle="1" w:styleId="berschrift5Zchn">
+    <w:name w:val="Überschrift 5 Zchn"/>
+    <w:basedOn w:val="Absatz-Standardschriftart"/>
+    <w:link w:val="berschrift5"/>
     <w:uiPriority w:val="9"/>
     <w:semiHidden/>
     <w:rsid w:val="00E56932"/>
@@ -4822,10 +4609,10 @@
       <w:color w:val="0F4761" w:themeColor="accent1" w:themeShade="BF"/>
     </w:rPr>
   </w:style>
-  <w:style w:type="character" w:customStyle="1" w:styleId="Heading6Char">
-    <w:name w:val="Heading 6 Char"/>
-    <w:basedOn w:val="DefaultParagraphFont"/>
-    <w:link w:val="Heading6"/>
+  <w:style w:type="character" w:customStyle="1" w:styleId="berschrift6Zchn">
+    <w:name w:val="Überschrift 6 Zchn"/>
+    <w:basedOn w:val="Absatz-Standardschriftart"/>
+    <w:link w:val="berschrift6"/>
     <w:uiPriority w:val="9"/>
     <w:semiHidden/>
     <w:rsid w:val="00E56932"/>
@@ -4836,10 +4623,10 @@
       <w:color w:val="595959" w:themeColor="text1" w:themeTint="A6"/>
     </w:rPr>
   </w:style>
-  <w:style w:type="character" w:customStyle="1" w:styleId="Heading7Char">
-    <w:name w:val="Heading 7 Char"/>
-    <w:basedOn w:val="DefaultParagraphFont"/>
-    <w:link w:val="Heading7"/>
+  <w:style w:type="character" w:customStyle="1" w:styleId="berschrift7Zchn">
+    <w:name w:val="Überschrift 7 Zchn"/>
+    <w:basedOn w:val="Absatz-Standardschriftart"/>
+    <w:link w:val="berschrift7"/>
     <w:uiPriority w:val="9"/>
     <w:semiHidden/>
     <w:rsid w:val="00E56932"/>
@@ -4848,10 +4635,10 @@
       <w:color w:val="595959" w:themeColor="text1" w:themeTint="A6"/>
     </w:rPr>
   </w:style>
-  <w:style w:type="character" w:customStyle="1" w:styleId="Heading8Char">
-    <w:name w:val="Heading 8 Char"/>
-    <w:basedOn w:val="DefaultParagraphFont"/>
-    <w:link w:val="Heading8"/>
+  <w:style w:type="character" w:customStyle="1" w:styleId="berschrift8Zchn">
+    <w:name w:val="Überschrift 8 Zchn"/>
+    <w:basedOn w:val="Absatz-Standardschriftart"/>
+    <w:link w:val="berschrift8"/>
     <w:uiPriority w:val="9"/>
     <w:semiHidden/>
     <w:rsid w:val="00E56932"/>
@@ -4862,10 +4649,10 @@
       <w:color w:val="272727" w:themeColor="text1" w:themeTint="D8"/>
     </w:rPr>
   </w:style>
-  <w:style w:type="character" w:customStyle="1" w:styleId="Heading9Char">
-    <w:name w:val="Heading 9 Char"/>
-    <w:basedOn w:val="DefaultParagraphFont"/>
-    <w:link w:val="Heading9"/>
+  <w:style w:type="character" w:customStyle="1" w:styleId="berschrift9Zchn">
+    <w:name w:val="Überschrift 9 Zchn"/>
+    <w:basedOn w:val="Absatz-Standardschriftart"/>
+    <w:link w:val="berschrift9"/>
     <w:uiPriority w:val="9"/>
     <w:semiHidden/>
     <w:rsid w:val="00E56932"/>
@@ -4874,11 +4661,11 @@
       <w:color w:val="272727" w:themeColor="text1" w:themeTint="D8"/>
     </w:rPr>
   </w:style>
-  <w:style w:type="paragraph" w:styleId="Title">
+  <w:style w:type="paragraph" w:styleId="Titel">
     <w:name w:val="Title"/>
-    <w:basedOn w:val="Normal"/>
-    <w:next w:val="Normal"/>
-    <w:link w:val="TitleChar"/>
+    <w:basedOn w:val="Standard"/>
+    <w:next w:val="Standard"/>
+    <w:link w:val="TitelZchn"/>
     <w:uiPriority w:val="10"/>
     <w:qFormat/>
     <w:rsid w:val="00E56932"/>
@@ -4894,10 +4681,10 @@
       <w:szCs w:val="56"/>
     </w:rPr>
   </w:style>
-  <w:style w:type="character" w:customStyle="1" w:styleId="TitleChar">
-    <w:name w:val="Title Char"/>
-    <w:basedOn w:val="DefaultParagraphFont"/>
-    <w:link w:val="Title"/>
+  <w:style w:type="character" w:customStyle="1" w:styleId="TitelZchn">
+    <w:name w:val="Titel Zchn"/>
+    <w:basedOn w:val="Absatz-Standardschriftart"/>
+    <w:link w:val="Titel"/>
     <w:uiPriority w:val="10"/>
     <w:rsid w:val="00E56932"/>
     <w:rPr>
@@ -4908,11 +4695,11 @@
       <w:szCs w:val="56"/>
     </w:rPr>
   </w:style>
-  <w:style w:type="paragraph" w:styleId="Subtitle">
+  <w:style w:type="paragraph" w:styleId="Untertitel">
     <w:name w:val="Subtitle"/>
-    <w:basedOn w:val="Normal"/>
-    <w:next w:val="Normal"/>
-    <w:link w:val="SubtitleChar"/>
+    <w:basedOn w:val="Standard"/>
+    <w:next w:val="Standard"/>
+    <w:link w:val="UntertitelZchn"/>
     <w:uiPriority w:val="11"/>
     <w:qFormat/>
     <w:rsid w:val="00E56932"/>
@@ -4929,10 +4716,10 @@
       <w:szCs w:val="28"/>
     </w:rPr>
   </w:style>
-  <w:style w:type="character" w:customStyle="1" w:styleId="SubtitleChar">
-    <w:name w:val="Subtitle Char"/>
-    <w:basedOn w:val="DefaultParagraphFont"/>
-    <w:link w:val="Subtitle"/>
+  <w:style w:type="character" w:customStyle="1" w:styleId="UntertitelZchn">
+    <w:name w:val="Untertitel Zchn"/>
+    <w:basedOn w:val="Absatz-Standardschriftart"/>
+    <w:link w:val="Untertitel"/>
     <w:uiPriority w:val="11"/>
     <w:rsid w:val="00E56932"/>
     <w:rPr>
@@ -4943,11 +4730,11 @@
       <w:szCs w:val="28"/>
     </w:rPr>
   </w:style>
-  <w:style w:type="paragraph" w:styleId="Quote">
+  <w:style w:type="paragraph" w:styleId="Zitat">
     <w:name w:val="Quote"/>
-    <w:basedOn w:val="Normal"/>
-    <w:next w:val="Normal"/>
-    <w:link w:val="QuoteChar"/>
+    <w:basedOn w:val="Standard"/>
+    <w:next w:val="Standard"/>
+    <w:link w:val="ZitatZchn"/>
     <w:uiPriority w:val="29"/>
     <w:qFormat/>
     <w:rsid w:val="00E56932"/>
@@ -4961,10 +4748,10 @@
       <w:color w:val="404040" w:themeColor="text1" w:themeTint="BF"/>
     </w:rPr>
   </w:style>
-  <w:style w:type="character" w:customStyle="1" w:styleId="QuoteChar">
-    <w:name w:val="Quote Char"/>
-    <w:basedOn w:val="DefaultParagraphFont"/>
-    <w:link w:val="Quote"/>
+  <w:style w:type="character" w:customStyle="1" w:styleId="ZitatZchn">
+    <w:name w:val="Zitat Zchn"/>
+    <w:basedOn w:val="Absatz-Standardschriftart"/>
+    <w:link w:val="Zitat"/>
     <w:uiPriority w:val="29"/>
     <w:rsid w:val="00E56932"/>
     <w:rPr>
@@ -4973,9 +4760,9 @@
       <w:color w:val="404040" w:themeColor="text1" w:themeTint="BF"/>
     </w:rPr>
   </w:style>
-  <w:style w:type="paragraph" w:styleId="ListParagraph">
+  <w:style w:type="paragraph" w:styleId="Listenabsatz">
     <w:name w:val="List Paragraph"/>
-    <w:basedOn w:val="Normal"/>
+    <w:basedOn w:val="Standard"/>
     <w:uiPriority w:val="34"/>
     <w:qFormat/>
     <w:rsid w:val="00E56932"/>
@@ -4984,9 +4771,9 @@
       <w:contextualSpacing/>
     </w:pPr>
   </w:style>
-  <w:style w:type="character" w:styleId="IntenseEmphasis">
+  <w:style w:type="character" w:styleId="IntensiveHervorhebung">
     <w:name w:val="Intense Emphasis"/>
-    <w:basedOn w:val="DefaultParagraphFont"/>
+    <w:basedOn w:val="Absatz-Standardschriftart"/>
     <w:uiPriority w:val="21"/>
     <w:qFormat/>
     <w:rsid w:val="00E56932"/>
@@ -4996,11 +4783,11 @@
       <w:color w:val="0F4761" w:themeColor="accent1" w:themeShade="BF"/>
     </w:rPr>
   </w:style>
-  <w:style w:type="paragraph" w:styleId="IntenseQuote">
+  <w:style w:type="paragraph" w:styleId="IntensivesZitat">
     <w:name w:val="Intense Quote"/>
-    <w:basedOn w:val="Normal"/>
-    <w:next w:val="Normal"/>
-    <w:link w:val="IntenseQuoteChar"/>
+    <w:basedOn w:val="Standard"/>
+    <w:next w:val="Standard"/>
+    <w:link w:val="IntensivesZitatZchn"/>
     <w:uiPriority w:val="30"/>
     <w:qFormat/>
     <w:rsid w:val="00E56932"/>
@@ -5019,10 +4806,10 @@
       <w:color w:val="0F4761" w:themeColor="accent1" w:themeShade="BF"/>
     </w:rPr>
   </w:style>
-  <w:style w:type="character" w:customStyle="1" w:styleId="IntenseQuoteChar">
-    <w:name w:val="Intense Quote Char"/>
-    <w:basedOn w:val="DefaultParagraphFont"/>
-    <w:link w:val="IntenseQuote"/>
+  <w:style w:type="character" w:customStyle="1" w:styleId="IntensivesZitatZchn">
+    <w:name w:val="Intensives Zitat Zchn"/>
+    <w:basedOn w:val="Absatz-Standardschriftart"/>
+    <w:link w:val="IntensivesZitat"/>
     <w:uiPriority w:val="30"/>
     <w:rsid w:val="00E56932"/>
     <w:rPr>
@@ -5031,9 +4818,9 @@
       <w:color w:val="0F4761" w:themeColor="accent1" w:themeShade="BF"/>
     </w:rPr>
   </w:style>
-  <w:style w:type="character" w:styleId="IntenseReference">
+  <w:style w:type="character" w:styleId="IntensiverVerweis">
     <w:name w:val="Intense Reference"/>
-    <w:basedOn w:val="DefaultParagraphFont"/>
+    <w:basedOn w:val="Absatz-Standardschriftart"/>
     <w:uiPriority w:val="32"/>
     <w:qFormat/>
     <w:rsid w:val="00E56932"/>
@@ -5045,9 +4832,9 @@
       <w:spacing w:val="5"/>
     </w:rPr>
   </w:style>
-  <w:style w:type="table" w:styleId="PlainTable2">
+  <w:style w:type="table" w:styleId="EinfacheTabelle2">
     <w:name w:val="Plain Table 2"/>
-    <w:basedOn w:val="TableNormal"/>
+    <w:basedOn w:val="NormaleTabelle"/>
     <w:uiPriority w:val="42"/>
     <w:rsid w:val="003603F1"/>
     <w:pPr>
@@ -5125,10 +4912,10 @@
       </w:tcPr>
     </w:tblStylePr>
   </w:style>
-  <w:style w:type="paragraph" w:styleId="Header">
+  <w:style w:type="paragraph" w:styleId="Kopfzeile">
     <w:name w:val="header"/>
-    <w:basedOn w:val="Normal"/>
-    <w:link w:val="HeaderChar"/>
+    <w:basedOn w:val="Standard"/>
+    <w:link w:val="KopfzeileZchn"/>
     <w:uiPriority w:val="99"/>
     <w:unhideWhenUsed/>
     <w:rsid w:val="004D76A2"/>
@@ -5140,17 +4927,17 @@
       <w:spacing w:after="0" w:line="240" w:lineRule="auto"/>
     </w:pPr>
   </w:style>
-  <w:style w:type="character" w:customStyle="1" w:styleId="HeaderChar">
-    <w:name w:val="Header Char"/>
-    <w:basedOn w:val="DefaultParagraphFont"/>
-    <w:link w:val="Header"/>
+  <w:style w:type="character" w:customStyle="1" w:styleId="KopfzeileZchn">
+    <w:name w:val="Kopfzeile Zchn"/>
+    <w:basedOn w:val="Absatz-Standardschriftart"/>
+    <w:link w:val="Kopfzeile"/>
     <w:uiPriority w:val="99"/>
     <w:rsid w:val="004D76A2"/>
   </w:style>
-  <w:style w:type="paragraph" w:styleId="Footer">
+  <w:style w:type="paragraph" w:styleId="Fuzeile">
     <w:name w:val="footer"/>
-    <w:basedOn w:val="Normal"/>
-    <w:link w:val="FooterChar"/>
+    <w:basedOn w:val="Standard"/>
+    <w:link w:val="FuzeileZchn"/>
     <w:uiPriority w:val="99"/>
     <w:unhideWhenUsed/>
     <w:rsid w:val="004D76A2"/>
@@ -5162,16 +4949,16 @@
       <w:spacing w:after="0" w:line="240" w:lineRule="auto"/>
     </w:pPr>
   </w:style>
-  <w:style w:type="character" w:customStyle="1" w:styleId="FooterChar">
-    <w:name w:val="Footer Char"/>
-    <w:basedOn w:val="DefaultParagraphFont"/>
-    <w:link w:val="Footer"/>
+  <w:style w:type="character" w:customStyle="1" w:styleId="FuzeileZchn">
+    <w:name w:val="Fußzeile Zchn"/>
+    <w:basedOn w:val="Absatz-Standardschriftart"/>
+    <w:link w:val="Fuzeile"/>
     <w:uiPriority w:val="99"/>
     <w:rsid w:val="004D76A2"/>
   </w:style>
   <w:style w:type="character" w:styleId="Hyperlink">
     <w:name w:val="Hyperlink"/>
-    <w:basedOn w:val="DefaultParagraphFont"/>
+    <w:basedOn w:val="Absatz-Standardschriftart"/>
     <w:uiPriority w:val="99"/>
     <w:unhideWhenUsed/>
     <w:rsid w:val="00906110"/>
@@ -5180,9 +4967,9 @@
       <w:u w:val="single"/>
     </w:rPr>
   </w:style>
-  <w:style w:type="character" w:styleId="UnresolvedMention">
+  <w:style w:type="character" w:styleId="NichtaufgelsteErwhnung">
     <w:name w:val="Unresolved Mention"/>
-    <w:basedOn w:val="DefaultParagraphFont"/>
+    <w:basedOn w:val="Absatz-Standardschriftart"/>
     <w:uiPriority w:val="99"/>
     <w:semiHidden/>
     <w:unhideWhenUsed/>
@@ -5192,10 +4979,10 @@
       <w:shd w:val="clear" w:color="auto" w:fill="E1DFDD"/>
     </w:rPr>
   </w:style>
-  <w:style w:type="paragraph" w:styleId="Caption">
+  <w:style w:type="paragraph" w:styleId="Beschriftung">
     <w:name w:val="caption"/>
-    <w:basedOn w:val="Normal"/>
-    <w:next w:val="Normal"/>
+    <w:basedOn w:val="Standard"/>
+    <w:next w:val="Standard"/>
     <w:uiPriority w:val="35"/>
     <w:unhideWhenUsed/>
     <w:qFormat/>
@@ -5211,9 +4998,9 @@
       <w:szCs w:val="18"/>
     </w:rPr>
   </w:style>
-  <w:style w:type="character" w:styleId="FollowedHyperlink">
+  <w:style w:type="character" w:styleId="BesuchterLink">
     <w:name w:val="FollowedHyperlink"/>
-    <w:basedOn w:val="DefaultParagraphFont"/>
+    <w:basedOn w:val="Absatz-Standardschriftart"/>
     <w:uiPriority w:val="99"/>
     <w:semiHidden/>
     <w:unhideWhenUsed/>
@@ -5223,9 +5010,9 @@
       <w:u w:val="single"/>
     </w:rPr>
   </w:style>
-  <w:style w:type="paragraph" w:styleId="NormalWeb">
+  <w:style w:type="paragraph" w:styleId="StandardWeb">
     <w:name w:val="Normal (Web)"/>
-    <w:basedOn w:val="Normal"/>
+    <w:basedOn w:val="Standard"/>
     <w:uiPriority w:val="99"/>
     <w:semiHidden/>
     <w:unhideWhenUsed/>
@@ -5236,7 +5023,7 @@
     <w:rPr>
       <w:rFonts w:ascii="Times New Roman" w:eastAsia="Times New Roman" w:hAnsi="Times New Roman" w:cs="Times New Roman"/>
       <w:kern w:val="0"/>
-      <w:lang w:val="en-CH" w:eastAsia="en-CH"/>
+      <w:lang/>
       <w14:ligatures w14:val="none"/>
     </w:rPr>
   </w:style>

</xml_diff>